<commit_message>
Section D closed: 6/7 org decisions resolved, support-channel monitoring left honestly OPEN; manual's stale run-loop + Resend claims corrected
</commit_message>
<xml_diff>
--- a/operations/SageReasoning_Support_Agent_Manual.docx
+++ b/operations/SageReasoning_Support_Agent_Manual.docx
@@ -130,7 +130,7 @@
           <w:sz w:val="22"/>
           <w:szCs w:val="22"/>
         </w:rPr>
-        <w:t xml:space="preserve">This manual explains how to use the SageReasoning support agent and mentor system. Everything described here is already deployed and running on your website. This chapter gives you the big picture before diving into each feature.</w:t>
+        <w:t xml:space="preserve">This manual explains how to use the SageReasoning support agent and mentor system. CORRECTED 2026-07-22: not everything described here is deployed and running. The markdown-based tools (inbox, knowledge base, workflows, notifications, leads) and the ring-wrapped support agent code all exist in the codebase as designed, but the automated run loop that would connect them to live tickets has never been wired up -- today, tickets are triaged manually by you opening files in support/inbox/ yourself. Treat any claim in this manual that a step already runs automatically as the designed target, not the current live state, unless operations/agent-org-2026-07/go-live-readiness-checklist.md says otherwise. This chapter gives you the big picture before diving into each feature.</w:t>
       </w:r>
     </w:p>
     <w:p>
@@ -3990,7 +3990,7 @@
           <w:sz w:val="22"/>
           <w:szCs w:val="22"/>
         </w:rPr>
-        <w:t xml:space="preserve">You need a RESEND_API_KEY environment variable set for sending to work. This should already be configured in your Vercel environment variables.</w:t>
+        <w:t xml:space="preserve">You need a RESEND_API_KEY environment variable set for sending to work. CORRECTED 2026-07-22: this has not yet been configured anywhere -- no Resend account exists yet, and this script runs locally from your own terminal, not on Vercel, so the key belongs in your local environment (for example a .env file you do not commit), not in Vercel environment variables. Setting this up (creating a Resend account, verifying a sending domain, and generating an API key) is tracked as a named follow-up -- see operations/agent-org-2026-07/go-live-readiness-checklist.md, item #15.</w:t>
       </w:r>
     </w:p>
     <w:p>

</xml_diff>